<commit_message>
docs(testing): record authenticated production checks
</commit_message>
<xml_diff>
--- a/docs/testing/session-testing/session-testing-report.docx
+++ b/docs/testing/session-testing/session-testing-report.docx
@@ -34,7 +34,7 @@
         <w:rPr>
           <w:b/>
         </w:rPr>
-        <w:t>The focused local snapshot passed 228 tests across 13 files. Production execution passed 2 smoke tests, 19 public GET checks, 3 protected GET checks and 7 browser checks, with overlapping assertions. Of 40 scenario groups, 2 passed, 4 are partial, 18 are blocked by fixtures or account setup and 16 await controlled execution or account setup. A separate appendix records 46 local creation boundary tests.</w:t>
+        <w:t>The focused local snapshot passed 228 tests across 13 files. Production execution passed 2 smoke tests, 19 public GET checks, 3 protected GET checks, 7 anonymous browser observations, 23 authenticated browser observations and 9 additional API checks, with overlapping assertions. The browser and API runs each recorded the payout-availability blocker separately. Of 40 scenario groups, 3 passed, 8 are partial, 15 are blocked and 14 await controlled execution. A separate appendix records 46 local creation boundary tests.</w:t>
       </w:r>
     </w:p>
     <w:tbl>
@@ -1247,7 +1247,7 @@
                 <w:color w:val="000000"/>
                 <w:sz w:val="17"/>
               </w:rPr>
-              <w:t>Anonymous API and browser pass; signed-in comparison not run.</w:t>
+              <w:t>Anonymous and signed-in views both empty; populated comparison not run.</w:t>
             </w:r>
           </w:p>
         </w:tc>
@@ -1451,7 +1451,7 @@
                 <w:color w:val="000000"/>
                 <w:sz w:val="17"/>
               </w:rPr>
-              <w:t>Not run. No controlled public/private, open/cancelled and full/non-full sessions.</w:t>
+              <w:t>No controlled visibility/state fixtures; payout setup unavailable.</w:t>
             </w:r>
           </w:p>
         </w:tc>
@@ -3171,7 +3171,7 @@
                 <w:color w:val="000000"/>
                 <w:sz w:val="17"/>
               </w:rPr>
-              <w:t>Not run. Ready booker and authenticated API harness needed to test omitted defaults.</w:t>
+              <w:t>Account exists; payout setup unavailable. Successful API creation not run.</w:t>
             </w:r>
           </w:p>
         </w:tc>
@@ -3375,7 +3375,7 @@
                 <w:color w:val="000000"/>
                 <w:sz w:val="17"/>
               </w:rPr>
-              <w:t>Not run. Ready booker and API inputs needed for every capacity partition.</w:t>
+              <w:t>UI stepper limits 2/29/30 observed; API/persistence cases blocked.</w:t>
             </w:r>
           </w:p>
         </w:tc>
@@ -3579,7 +3579,7 @@
                 <w:color w:val="000000"/>
                 <w:sz w:val="17"/>
               </w:rPr>
-              <w:t>Not run. Ready booker and API inputs needed for every headcount partition.</w:t>
+              <w:t>UI headcount limits 2..capacity observed; API/persistence cases blocked.</w:t>
             </w:r>
           </w:p>
         </w:tc>
@@ -3783,7 +3783,7 @@
                 <w:color w:val="000000"/>
                 <w:sz w:val="17"/>
               </w:rPr>
-              <w:t>Not run. Ready booker needed to verify accepted prices and saved state.</w:t>
+              <w:t>333c/range display and invalid 166/667/333.5c UI checks pass; accepted saves blocked.</w:t>
             </w:r>
           </w:p>
         </w:tc>
@@ -3812,7 +3812,7 @@
                 <w:color w:val="000000"/>
                 <w:sz w:val="17"/>
               </w:rPr>
-              <w:t>Blocked</w:t>
+              <w:t>Partial</w:t>
             </w:r>
           </w:p>
         </w:tc>
@@ -3987,7 +3987,7 @@
                 <w:color w:val="000000"/>
                 <w:sz w:val="17"/>
               </w:rPr>
-              <w:t>Not run. Ready booker and API inputs needed for all cost and reliability partitions.</w:t>
+              <w:t>Negative/zero/too-small costs rejected in UI; accepted costs and reliability not run.</w:t>
             </w:r>
           </w:p>
         </w:tc>
@@ -4016,7 +4016,7 @@
                 <w:color w:val="000000"/>
                 <w:sz w:val="17"/>
               </w:rPr>
-              <w:t>Blocked</w:t>
+              <w:t>Partial</w:t>
             </w:r>
           </w:p>
         </w:tc>
@@ -4191,7 +4191,7 @@
                 <w:color w:val="000000"/>
                 <w:sz w:val="17"/>
               </w:rPr>
-              <w:t>Not run. Controlled clock and API harness needed for millisecond boundaries.</w:t>
+              <w:t>Past date and invalid minute durations rejected in UI; exact-ms cases pending.</w:t>
             </w:r>
           </w:p>
         </w:tc>
@@ -4395,7 +4395,7 @@
                 <w:color w:val="000000"/>
                 <w:sz w:val="17"/>
               </w:rPr>
-              <w:t>Not run. Prepared test account awaits final terms acceptance; account-state fixtures absent.</w:t>
+              <w:t>Blank venue UI rejected; creation API 409 payout guard; hosted API 200 with zero sessions.</w:t>
             </w:r>
           </w:p>
         </w:tc>
@@ -4424,7 +4424,7 @@
                 <w:color w:val="000000"/>
                 <w:sz w:val="17"/>
               </w:rPr>
-              <w:t>Pending</w:t>
+              <w:t>Partial</w:t>
             </w:r>
           </w:p>
         </w:tc>
@@ -5095,7 +5095,7 @@
                 <w:color w:val="000000"/>
                 <w:sz w:val="17"/>
               </w:rPr>
-              <w:t>Not run. No owned OPEN future session; creation requires completed payout setup.</w:t>
+              <w:t>No owned OPEN session; payout setup unavailable.</w:t>
             </w:r>
           </w:p>
         </w:tc>
@@ -5299,7 +5299,7 @@
                 <w:color w:val="000000"/>
                 <w:sz w:val="17"/>
               </w:rPr>
-              <w:t>Not run. No owned PUBLIC future session.</w:t>
+              <w:t>No owned PUBLIC session; payout setup unavailable.</w:t>
             </w:r>
           </w:p>
         </w:tc>
@@ -5503,7 +5503,7 @@
                 <w:color w:val="000000"/>
                 <w:sz w:val="17"/>
               </w:rPr>
-              <w:t>Not run. Requires owned session and foreign/inactive identities; visibility requests not run.</w:t>
+              <w:t>Anonymous API request rejected 401; inactive/non-owner cases not run.</w:t>
             </w:r>
           </w:p>
         </w:tc>
@@ -5532,7 +5532,7 @@
                 <w:color w:val="000000"/>
                 <w:sz w:val="17"/>
               </w:rPr>
-              <w:t>Pending</w:t>
+              <w:t>Partial</w:t>
             </w:r>
           </w:p>
         </w:tc>
@@ -5707,7 +5707,7 @@
                 <w:color w:val="000000"/>
                 <w:sz w:val="17"/>
               </w:rPr>
-              <w:t>Not run. One-place, full and replacement-reserved fixtures absent.</w:t>
+              <w:t>One-place/full/reserved fixtures unavailable.</w:t>
             </w:r>
           </w:p>
         </w:tc>
@@ -6115,7 +6115,7 @@
                 <w:color w:val="000000"/>
                 <w:sz w:val="17"/>
               </w:rPr>
-              <w:t>Not run. Eligible/full/closed/foreign fixtures and authenticated API harness absent.</w:t>
+              <w:t>Eligible/full/closed/foreign session fixtures absent.</w:t>
             </w:r>
           </w:p>
         </w:tc>
@@ -6319,7 +6319,7 @@
                 <w:color w:val="000000"/>
                 <w:sz w:val="17"/>
               </w:rPr>
-              <w:t>Not run. Authentication required to reach visibility input parser.</w:t>
+              <w:t>Six API parser checks pass: invalid inputs 400; valid enums reach missing-session 404.</w:t>
             </w:r>
           </w:p>
         </w:tc>
@@ -6348,7 +6348,7 @@
                 <w:color w:val="000000"/>
                 <w:sz w:val="17"/>
               </w:rPr>
-              <w:t>Blocked</w:t>
+              <w:t>Pass (API)</w:t>
             </w:r>
           </w:p>
         </w:tc>
@@ -6578,7 +6578,7 @@
           <w:b w:val="0"/>
           <w:sz w:val="17"/>
         </w:rPr>
-        <w:t>Source: app/sessions/visibility-input.ts:8-13; use-cases/sessions/ToggleSessionVisibility.ts:23-35; domain/accounts/booker.ts:172-198; app/sessions/README.md:242-291.</w:t>
+        <w:t>Source: app/sessions/visibility-input.ts:8-13; use-cases/sessions/ToggleSessionVisibility.ts:20-31; domain/accounts/booker.ts:172-198; app/sessions/README.md:242-291.</w:t>
       </w:r>
     </w:p>
     <w:p>
@@ -7019,7 +7019,7 @@
                 <w:color w:val="000000"/>
                 <w:sz w:val="17"/>
               </w:rPr>
-              <w:t>Not run. No committed target holding the historical 733c share.</w:t>
+              <w:t>No funded committed target; payout/top-up UI unavailable.</w:t>
             </w:r>
           </w:p>
         </w:tc>
@@ -7427,7 +7427,7 @@
                 <w:color w:val="000000"/>
                 <w:sz w:val="17"/>
               </w:rPr>
-              <w:t>Not run. Waitlisted/left/withdrawn/removed target fixtures absent.</w:t>
+              <w:t>Required participant-state fixtures absent.</w:t>
             </w:r>
           </w:p>
         </w:tc>
@@ -7631,7 +7631,7 @@
                 <w:color w:val="000000"/>
                 <w:sz w:val="17"/>
               </w:rPr>
-              <w:t>Not run. Foreign/inactive identities and owned session/target fixtures absent.</w:t>
+              <w:t>Foreign/inactive and owned target fixtures absent.</w:t>
             </w:r>
           </w:p>
         </w:tc>
@@ -8943,7 +8943,7 @@
                 <w:color w:val="000000"/>
                 <w:sz w:val="17"/>
               </w:rPr>
-              <w:t>Not run. Two committed targets holding 500c and 733c absent.</w:t>
+              <w:t>No funded 500c/733c targets; payout/top-up UI unavailable.</w:t>
             </w:r>
           </w:p>
         </w:tc>
@@ -9147,7 +9147,7 @@
                 <w:color w:val="000000"/>
                 <w:sz w:val="17"/>
               </w:rPr>
-              <w:t>Not run. No owned empty or full session available.</w:t>
+              <w:t>No owned empty/full session; payout setup unavailable.</w:t>
             </w:r>
           </w:p>
         </w:tc>
@@ -9351,7 +9351,7 @@
                 <w:color w:val="000000"/>
                 <w:sz w:val="17"/>
               </w:rPr>
-              <w:t>Not run. Mixed committed/waitlisted/removed history fixture absent.</w:t>
+              <w:t>Mixed participant-history fixture absent.</w:t>
             </w:r>
           </w:p>
         </w:tc>
@@ -9963,7 +9963,7 @@
                 <w:color w:val="000000"/>
                 <w:sz w:val="17"/>
               </w:rPr>
-              <w:t>Not run. No owned eligible session and cancellation preview.</w:t>
+              <w:t>No owned session or cancellation preview.</w:t>
             </w:r>
           </w:p>
         </w:tc>
@@ -10457,7 +10457,7 @@
           <w:b w:val="0"/>
           <w:sz w:val="20"/>
         </w:rPr>
-        <w:t>The public discovery service returned HTTP 200, a valid empty page and Cache-Control: no-store. D05 search-length boundaries passed through both HTTP and browser interfaces. D07 malformed-filter inputs passed through HTTP; browser checks also showed errors for missing date and equal or reversed time bounds.</w:t>
+        <w:t>The public discovery service returned HTTP 200, a valid empty page and Cache-Control: no-store. D05 search-length boundaries passed through HTTP and browser interfaces. D07 malformed-filter inputs passed through HTTP; selected browser time errors were also observed.</w:t>
       </w:r>
     </w:p>
     <w:p>
@@ -10466,7 +10466,7 @@
           <w:b w:val="0"/>
           <w:sz w:val="20"/>
         </w:rPr>
-        <w:t>The empty dataset limited filtering and pagination checks. D01, D04, D06 and D08 therefore remain partial: query acceptance and the zero-result view do not establish matching, lifecycle exclusion, exact time boundaries or multi-page results.</w:t>
+        <w:t>Anonymous and signed-in discovery both showed the empty result. Populated filtering, exact-time and pagination fixtures remain unavailable. V07 now passes all six API transport subcases: invalid inputs returned 400, while exact valid enums reached the nonexistent-session 404 response. No saved visibility change is claimed.</w:t>
       </w:r>
     </w:p>
     <w:p>
@@ -10475,7 +10475,7 @@
           <w:b w:val="0"/>
           <w:sz w:val="20"/>
         </w:rPr>
-        <w:t>Account registration was prepared as Neoh Session QA. Public authentication settings enable email signup and auto-confirmation. The final Create account step accepts Terms and Privacy Policy and was awaiting confirmation when this report was generated; no account or session was created. Hosting additionally requires completed Stripe test-mode payout onboarding.</w:t>
+        <w:t>Neoh Session QA was created and signed in. Creation API returned 409 PAYOUT_ACCOUNT_NOT_READY, and the hosted API returned 200 with zero sessions. Payout-account GET returned 503 PAYOUTS_UNAVAILABLE. Wallet balances were zero and top-up UI said coming soon, preventing owned-session and funded-participant fixtures.</w:t>
       </w:r>
     </w:p>
     <w:tbl>
@@ -10888,7 +10888,7 @@
                 <w:color w:val="000000"/>
                 <w:sz w:val="18"/>
               </w:rPr>
-              <w:t>Browser observations</w:t>
+              <w:t>Anonymous browser observations</w:t>
             </w:r>
           </w:p>
         </w:tc>
@@ -10944,97 +10944,7 @@
                 <w:color w:val="000000"/>
                 <w:sz w:val="18"/>
               </w:rPr>
-              <w:t>7 observations passed. No sign-in or management action was executed.</w:t>
-            </w:r>
-          </w:p>
-        </w:tc>
-      </w:tr>
-      <w:tr>
-        <w:trPr>
-          <w:cantSplit/>
-        </w:trPr>
-        <w:tc>
-          <w:tcPr>
-            <w:tcW w:type="dxa" w:w="3168"/>
-            <w:vAlign w:val="center"/>
-            <w:tcMar>
-              <w:top w:w="75" w:type="dxa"/>
-              <w:left w:w="75" w:type="dxa"/>
-              <w:bottom w:w="75" w:type="dxa"/>
-              <w:right w:w="75" w:type="dxa"/>
-            </w:tcMar>
-            <w:shd w:fill="FFFFFF"/>
-          </w:tcPr>
-          <w:p>
-            <w:pPr>
-              <w:keepNext w:val="0"/>
-              <w:spacing w:after="0" w:line="250" w:lineRule="auto"/>
-              <w:jc w:val="center"/>
-            </w:pPr>
-            <w:r>
-              <w:rPr>
-                <w:rFonts w:ascii="Arial" w:hAnsi="Arial"/>
-                <w:b w:val="0"/>
-                <w:color w:val="000000"/>
-                <w:sz w:val="18"/>
-              </w:rPr>
-              <w:t>Test account setup</w:t>
-            </w:r>
-          </w:p>
-        </w:tc>
-        <w:tc>
-          <w:tcPr>
-            <w:tcW w:type="dxa" w:w="7488"/>
-            <w:vAlign w:val="center"/>
-            <w:tcMar>
-              <w:top w:w="75" w:type="dxa"/>
-              <w:left w:w="75" w:type="dxa"/>
-              <w:bottom w:w="75" w:type="dxa"/>
-              <w:right w:w="75" w:type="dxa"/>
-            </w:tcMar>
-            <w:shd w:fill="FFFFFF"/>
-          </w:tcPr>
-          <w:p>
-            <w:pPr>
-              <w:keepNext w:val="0"/>
-              <w:spacing w:after="0" w:line="250" w:lineRule="auto"/>
-            </w:pPr>
-            <w:r>
-              <w:rPr>
-                <w:rFonts w:ascii="Arial" w:hAnsi="Arial"/>
-                <w:b w:val="0"/>
-                <w:color w:val="000000"/>
-                <w:sz w:val="18"/>
-              </w:rPr>
-              <w:t>Profile form prepared; final Terms/Privacy acceptance not submitted.</w:t>
-            </w:r>
-          </w:p>
-        </w:tc>
-        <w:tc>
-          <w:tcPr>
-            <w:tcW w:type="dxa" w:w="4435"/>
-            <w:vAlign w:val="center"/>
-            <w:tcMar>
-              <w:top w:w="75" w:type="dxa"/>
-              <w:left w:w="75" w:type="dxa"/>
-              <w:bottom w:w="75" w:type="dxa"/>
-              <w:right w:w="75" w:type="dxa"/>
-            </w:tcMar>
-            <w:shd w:fill="FFFFFF"/>
-          </w:tcPr>
-          <w:p>
-            <w:pPr>
-              <w:keepNext w:val="0"/>
-              <w:spacing w:after="0" w:line="250" w:lineRule="auto"/>
-            </w:pPr>
-            <w:r>
-              <w:rPr>
-                <w:rFonts w:ascii="Arial" w:hAnsi="Arial"/>
-                <w:b w:val="0"/>
-                <w:color w:val="000000"/>
-                <w:sz w:val="18"/>
-              </w:rPr>
-              <w:t>Account-dependent cases await confirmation and setup.</w:t>
+              <w:t>7 earlier observations passed; retained separately from the authenticated run.</w:t>
             </w:r>
           </w:p>
         </w:tc>
@@ -11051,7 +10961,7 @@
           <w:b w:val="0"/>
           <w:sz w:val="18"/>
         </w:rPr>
-        <w:t>The check counts are separate suites and include overlapping assertions; do not add them into a unique-case total or combine them with local unit totals. No live session creation, visibility change, removal, cancellation, financial refund, concurrent transaction or injected failure is claimed. Controlled-clock and failure-injection scenarios remain pending; missing account/participant/session fixtures are marked blocked.</w:t>
+        <w:t>Counts describe separate suites with overlapping assertions; do not sum them into a unique-case total or combine them with local unit totals. One test account was created. Production creation returned 409 PAYOUT_ACCOUNT_NOT_READY, while hosted GET returned 200 with zero sessions; this is application-level evidence, not a database query. No successful live session creation, visibility change, removal, cancellation, refund, concurrent transaction or injected failure is claimed. Controlled-clock/failure-injection cases remain pending; unavailable session, participant, account-state and funding fixtures remain blocked.</w:t>
       </w:r>
     </w:p>
     <w:p>
@@ -11061,6 +10971,1580 @@
           <w:sz w:val="18"/>
         </w:rPr>
         <w:t>Evidence: evidence/production/ contains sanitized HTTP results, browser observations and the read-only reproduction script. No account passwords, tokens or private user records are included.</w:t>
+      </w:r>
+    </w:p>
+    <w:p>
+      <w:r>
+        <w:br w:type="page"/>
+      </w:r>
+    </w:p>
+    <w:p>
+      <w:pPr>
+        <w:pStyle w:val="Heading1"/>
+      </w:pPr>
+      <w:r>
+        <w:t>Authenticated browser checks</w:t>
+      </w:r>
+    </w:p>
+    <w:p>
+      <w:r>
+        <w:rPr>
+          <w:b w:val="0"/>
+          <w:sz w:val="20"/>
+        </w:rPr>
+        <w:t>An approved production signup created Neoh Session QA at 17:04:24 Singapore time on 20 October 2026. The signed-in browser recorded 23 successful observations and one payout-availability blocker from 17:05:31 to 17:12:58. These are UI observations; the browser run did not capture an authenticated creation HTTP status. A later API run, reported separately, captured the exact status. Credentials are excluded from evidence.</w:t>
+      </w:r>
+    </w:p>
+    <w:tbl>
+      <w:tblPr>
+        <w:tblW w:type="auto" w:w="0"/>
+        <w:jc w:val="center"/>
+        <w:tblLayout w:type="fixed"/>
+        <w:tblLook w:firstColumn="1" w:firstRow="1" w:lastColumn="0" w:lastRow="0" w:noHBand="0" w:noVBand="1" w:val="04A0"/>
+        <w:tblBorders>
+          <w:top w:val="single" w:sz="4" w:color="D9D9D9"/>
+          <w:left w:val="single" w:sz="4" w:color="D9D9D9"/>
+          <w:bottom w:val="single" w:sz="4" w:color="D9D9D9"/>
+          <w:right w:val="single" w:sz="4" w:color="D9D9D9"/>
+          <w:insideH w:val="single" w:sz="4" w:color="D9D9D9"/>
+          <w:insideV w:val="single" w:sz="4" w:color="D9D9D9"/>
+        </w:tblBorders>
+      </w:tblPr>
+      <w:tblGrid>
+        <w:gridCol w:w="3168"/>
+        <w:gridCol w:w="7488"/>
+        <w:gridCol w:w="4435"/>
+      </w:tblGrid>
+      <w:tr>
+        <w:trPr>
+          <w:cantSplit/>
+          <w:tblHeader/>
+        </w:trPr>
+        <w:tc>
+          <w:tcPr>
+            <w:tcW w:type="dxa" w:w="3168"/>
+            <w:vAlign w:val="center"/>
+            <w:tcMar>
+              <w:top w:w="75" w:type="dxa"/>
+              <w:left w:w="75" w:type="dxa"/>
+              <w:bottom w:w="75" w:type="dxa"/>
+              <w:right w:w="75" w:type="dxa"/>
+            </w:tcMar>
+            <w:shd w:fill="E7E7E7"/>
+          </w:tcPr>
+          <w:p>
+            <w:pPr>
+              <w:keepNext/>
+              <w:spacing w:after="0" w:line="250" w:lineRule="auto"/>
+              <w:jc w:val="center"/>
+            </w:pPr>
+            <w:r>
+              <w:rPr>
+                <w:rFonts w:ascii="Arial" w:hAnsi="Arial"/>
+                <w:b/>
+                <w:color w:val="000000"/>
+                <w:sz w:val="18"/>
+              </w:rPr>
+              <w:t>Check</w:t>
+            </w:r>
+          </w:p>
+        </w:tc>
+        <w:tc>
+          <w:tcPr>
+            <w:tcW w:type="dxa" w:w="7488"/>
+            <w:vAlign w:val="center"/>
+            <w:tcMar>
+              <w:top w:w="75" w:type="dxa"/>
+              <w:left w:w="75" w:type="dxa"/>
+              <w:bottom w:w="75" w:type="dxa"/>
+              <w:right w:w="75" w:type="dxa"/>
+            </w:tcMar>
+            <w:shd w:fill="E7E7E7"/>
+          </w:tcPr>
+          <w:p>
+            <w:pPr>
+              <w:keepNext/>
+              <w:spacing w:after="0" w:line="250" w:lineRule="auto"/>
+            </w:pPr>
+            <w:r>
+              <w:rPr>
+                <w:rFonts w:ascii="Arial" w:hAnsi="Arial"/>
+                <w:b/>
+                <w:color w:val="000000"/>
+                <w:sz w:val="18"/>
+              </w:rPr>
+              <w:t>Observed output</w:t>
+            </w:r>
+          </w:p>
+        </w:tc>
+        <w:tc>
+          <w:tcPr>
+            <w:tcW w:type="dxa" w:w="4435"/>
+            <w:vAlign w:val="center"/>
+            <w:tcMar>
+              <w:top w:w="75" w:type="dxa"/>
+              <w:left w:w="75" w:type="dxa"/>
+              <w:bottom w:w="75" w:type="dxa"/>
+              <w:right w:w="75" w:type="dxa"/>
+            </w:tcMar>
+            <w:shd w:fill="E7E7E7"/>
+          </w:tcPr>
+          <w:p>
+            <w:pPr>
+              <w:keepNext/>
+              <w:spacing w:after="0" w:line="250" w:lineRule="auto"/>
+            </w:pPr>
+            <w:r>
+              <w:rPr>
+                <w:rFonts w:ascii="Arial" w:hAnsi="Arial"/>
+                <w:b/>
+                <w:color w:val="000000"/>
+                <w:sz w:val="18"/>
+              </w:rPr>
+              <w:t>Conclusion</w:t>
+            </w:r>
+          </w:p>
+        </w:tc>
+      </w:tr>
+      <w:tr>
+        <w:trPr>
+          <w:cantSplit/>
+        </w:trPr>
+        <w:tc>
+          <w:tcPr>
+            <w:tcW w:type="dxa" w:w="3168"/>
+            <w:vAlign w:val="center"/>
+            <w:tcMar>
+              <w:top w:w="75" w:type="dxa"/>
+              <w:left w:w="75" w:type="dxa"/>
+              <w:bottom w:w="75" w:type="dxa"/>
+              <w:right w:w="75" w:type="dxa"/>
+            </w:tcMar>
+            <w:shd w:fill="FFFFFF"/>
+          </w:tcPr>
+          <w:p>
+            <w:pPr>
+              <w:keepNext w:val="0"/>
+              <w:spacing w:after="0" w:line="250" w:lineRule="auto"/>
+              <w:jc w:val="center"/>
+            </w:pPr>
+            <w:r>
+              <w:rPr>
+                <w:rFonts w:ascii="Arial" w:hAnsi="Arial"/>
+                <w:b w:val="0"/>
+                <w:color w:val="000000"/>
+                <w:sz w:val="18"/>
+              </w:rPr>
+              <w:t>Signup and discovery</w:t>
+            </w:r>
+          </w:p>
+        </w:tc>
+        <w:tc>
+          <w:tcPr>
+            <w:tcW w:type="dxa" w:w="7488"/>
+            <w:vAlign w:val="center"/>
+            <w:tcMar>
+              <w:top w:w="75" w:type="dxa"/>
+              <w:left w:w="75" w:type="dxa"/>
+              <w:bottom w:w="75" w:type="dxa"/>
+              <w:right w:w="75" w:type="dxa"/>
+            </w:tcMar>
+            <w:shd w:fill="FFFFFF"/>
+          </w:tcPr>
+          <w:p>
+            <w:pPr>
+              <w:keepNext w:val="0"/>
+              <w:spacing w:after="0" w:line="250" w:lineRule="auto"/>
+            </w:pPr>
+            <w:r>
+              <w:rPr>
+                <w:rFonts w:ascii="Arial" w:hAnsi="Arial"/>
+                <w:b w:val="0"/>
+                <w:color w:val="000000"/>
+                <w:sz w:val="18"/>
+              </w:rPr>
+              <w:t>Account created and signed in; signed-in Discover showed the same empty result as the anonymous run.</w:t>
+            </w:r>
+          </w:p>
+        </w:tc>
+        <w:tc>
+          <w:tcPr>
+            <w:tcW w:type="dxa" w:w="4435"/>
+            <w:vAlign w:val="center"/>
+            <w:tcMar>
+              <w:top w:w="75" w:type="dxa"/>
+              <w:left w:w="75" w:type="dxa"/>
+              <w:bottom w:w="75" w:type="dxa"/>
+              <w:right w:w="75" w:type="dxa"/>
+            </w:tcMar>
+            <w:shd w:fill="FFFFFF"/>
+          </w:tcPr>
+          <w:p>
+            <w:pPr>
+              <w:keepNext w:val="0"/>
+              <w:spacing w:after="0" w:line="250" w:lineRule="auto"/>
+            </w:pPr>
+            <w:r>
+              <w:rPr>
+                <w:rFonts w:ascii="Arial" w:hAnsi="Arial"/>
+                <w:b w:val="0"/>
+                <w:color w:val="000000"/>
+                <w:sz w:val="18"/>
+              </w:rPr>
+              <w:t>D01 remains partial without populated fixtures.</w:t>
+            </w:r>
+          </w:p>
+        </w:tc>
+      </w:tr>
+      <w:tr>
+        <w:trPr>
+          <w:cantSplit/>
+        </w:trPr>
+        <w:tc>
+          <w:tcPr>
+            <w:tcW w:type="dxa" w:w="3168"/>
+            <w:vAlign w:val="center"/>
+            <w:tcMar>
+              <w:top w:w="75" w:type="dxa"/>
+              <w:left w:w="75" w:type="dxa"/>
+              <w:bottom w:w="75" w:type="dxa"/>
+              <w:right w:w="75" w:type="dxa"/>
+            </w:tcMar>
+            <w:shd w:fill="FFFFFF"/>
+          </w:tcPr>
+          <w:p>
+            <w:pPr>
+              <w:keepNext w:val="0"/>
+              <w:spacing w:after="0" w:line="250" w:lineRule="auto"/>
+              <w:jc w:val="center"/>
+            </w:pPr>
+            <w:r>
+              <w:rPr>
+                <w:rFonts w:ascii="Arial" w:hAnsi="Arial"/>
+                <w:b w:val="0"/>
+                <w:color w:val="000000"/>
+                <w:sz w:val="18"/>
+              </w:rPr>
+              <w:t>Schedule dialog</w:t>
+            </w:r>
+          </w:p>
+        </w:tc>
+        <w:tc>
+          <w:tcPr>
+            <w:tcW w:type="dxa" w:w="7488"/>
+            <w:vAlign w:val="center"/>
+            <w:tcMar>
+              <w:top w:w="75" w:type="dxa"/>
+              <w:left w:w="75" w:type="dxa"/>
+              <w:bottom w:w="75" w:type="dxa"/>
+              <w:right w:w="75" w:type="dxa"/>
+            </w:tcMar>
+            <w:shd w:fill="FFFFFF"/>
+          </w:tcPr>
+          <w:p>
+            <w:pPr>
+              <w:keepNext w:val="0"/>
+              <w:spacing w:after="0" w:line="250" w:lineRule="auto"/>
+            </w:pPr>
+            <w:r>
+              <w:rPr>
+                <w:rFonts w:ascii="Arial" w:hAnsi="Arial"/>
+                <w:b w:val="0"/>
+                <w:color w:val="000000"/>
+                <w:sz w:val="18"/>
+              </w:rPr>
+              <w:t>Zero, negative and fractional-minute durations rejected; a past start date rejected.</w:t>
+            </w:r>
+          </w:p>
+        </w:tc>
+        <w:tc>
+          <w:tcPr>
+            <w:tcW w:type="dxa" w:w="4435"/>
+            <w:vAlign w:val="center"/>
+            <w:tcMar>
+              <w:top w:w="75" w:type="dxa"/>
+              <w:left w:w="75" w:type="dxa"/>
+              <w:bottom w:w="75" w:type="dxa"/>
+              <w:right w:w="75" w:type="dxa"/>
+            </w:tcMar>
+            <w:shd w:fill="FFFFFF"/>
+          </w:tcPr>
+          <w:p>
+            <w:pPr>
+              <w:keepNext w:val="0"/>
+              <w:spacing w:after="0" w:line="250" w:lineRule="auto"/>
+            </w:pPr>
+            <w:r>
+              <w:rPr>
+                <w:rFonts w:ascii="Arial" w:hAnsi="Arial"/>
+                <w:b w:val="0"/>
+                <w:color w:val="000000"/>
+                <w:sz w:val="18"/>
+              </w:rPr>
+              <w:t>Supplemental UI checks; C06 exact-ms cases pending.</w:t>
+            </w:r>
+          </w:p>
+        </w:tc>
+      </w:tr>
+      <w:tr>
+        <w:trPr>
+          <w:cantSplit/>
+        </w:trPr>
+        <w:tc>
+          <w:tcPr>
+            <w:tcW w:type="dxa" w:w="3168"/>
+            <w:vAlign w:val="center"/>
+            <w:tcMar>
+              <w:top w:w="75" w:type="dxa"/>
+              <w:left w:w="75" w:type="dxa"/>
+              <w:bottom w:w="75" w:type="dxa"/>
+              <w:right w:w="75" w:type="dxa"/>
+            </w:tcMar>
+            <w:shd w:fill="FFFFFF"/>
+          </w:tcPr>
+          <w:p>
+            <w:pPr>
+              <w:keepNext w:val="0"/>
+              <w:spacing w:after="0" w:line="250" w:lineRule="auto"/>
+              <w:jc w:val="center"/>
+            </w:pPr>
+            <w:r>
+              <w:rPr>
+                <w:rFonts w:ascii="Arial" w:hAnsi="Arial"/>
+                <w:b w:val="0"/>
+                <w:color w:val="000000"/>
+                <w:sz w:val="18"/>
+              </w:rPr>
+              <w:t>Capacity and headcount</w:t>
+            </w:r>
+          </w:p>
+        </w:tc>
+        <w:tc>
+          <w:tcPr>
+            <w:tcW w:type="dxa" w:w="7488"/>
+            <w:vAlign w:val="center"/>
+            <w:tcMar>
+              <w:top w:w="75" w:type="dxa"/>
+              <w:left w:w="75" w:type="dxa"/>
+              <w:bottom w:w="75" w:type="dxa"/>
+              <w:right w:w="75" w:type="dxa"/>
+            </w:tcMar>
+            <w:shd w:fill="FFFFFF"/>
+          </w:tcPr>
+          <w:p>
+            <w:pPr>
+              <w:keepNext w:val="0"/>
+              <w:spacing w:after="0" w:line="250" w:lineRule="auto"/>
+            </w:pPr>
+            <w:r>
+              <w:rPr>
+                <w:rFonts w:ascii="Arial" w:hAnsi="Arial"/>
+                <w:b w:val="0"/>
+                <w:color w:val="000000"/>
+                <w:sz w:val="18"/>
+              </w:rPr>
+              <w:t>Slots 2/29/30 and headcount 2..capacity control limits observed.</w:t>
+            </w:r>
+          </w:p>
+        </w:tc>
+        <w:tc>
+          <w:tcPr>
+            <w:tcW w:type="dxa" w:w="4435"/>
+            <w:vAlign w:val="center"/>
+            <w:tcMar>
+              <w:top w:w="75" w:type="dxa"/>
+              <w:left w:w="75" w:type="dxa"/>
+              <w:bottom w:w="75" w:type="dxa"/>
+              <w:right w:w="75" w:type="dxa"/>
+            </w:tcMar>
+            <w:shd w:fill="FFFFFF"/>
+          </w:tcPr>
+          <w:p>
+            <w:pPr>
+              <w:keepNext w:val="0"/>
+              <w:spacing w:after="0" w:line="250" w:lineRule="auto"/>
+            </w:pPr>
+            <w:r>
+              <w:rPr>
+                <w:rFonts w:ascii="Arial" w:hAnsi="Arial"/>
+                <w:b w:val="0"/>
+                <w:color w:val="000000"/>
+                <w:sz w:val="18"/>
+              </w:rPr>
+              <w:t>C02/C03 API and persistence cases remain blocked.</w:t>
+            </w:r>
+          </w:p>
+        </w:tc>
+      </w:tr>
+      <w:tr>
+        <w:trPr>
+          <w:cantSplit/>
+        </w:trPr>
+        <w:tc>
+          <w:tcPr>
+            <w:tcW w:type="dxa" w:w="3168"/>
+            <w:vAlign w:val="center"/>
+            <w:tcMar>
+              <w:top w:w="75" w:type="dxa"/>
+              <w:left w:w="75" w:type="dxa"/>
+              <w:bottom w:w="75" w:type="dxa"/>
+              <w:right w:w="75" w:type="dxa"/>
+            </w:tcMar>
+            <w:shd w:fill="FFFFFF"/>
+          </w:tcPr>
+          <w:p>
+            <w:pPr>
+              <w:keepNext w:val="0"/>
+              <w:spacing w:after="0" w:line="250" w:lineRule="auto"/>
+              <w:jc w:val="center"/>
+            </w:pPr>
+            <w:r>
+              <w:rPr>
+                <w:rFonts w:ascii="Arial" w:hAnsi="Arial"/>
+                <w:b w:val="0"/>
+                <w:color w:val="000000"/>
+                <w:sz w:val="18"/>
+              </w:rPr>
+              <w:t>Booking cost</w:t>
+            </w:r>
+          </w:p>
+        </w:tc>
+        <w:tc>
+          <w:tcPr>
+            <w:tcW w:type="dxa" w:w="7488"/>
+            <w:vAlign w:val="center"/>
+            <w:tcMar>
+              <w:top w:w="75" w:type="dxa"/>
+              <w:left w:w="75" w:type="dxa"/>
+              <w:bottom w:w="75" w:type="dxa"/>
+              <w:right w:w="75" w:type="dxa"/>
+            </w:tcMar>
+            <w:shd w:fill="FFFFFF"/>
+          </w:tcPr>
+          <w:p>
+            <w:pPr>
+              <w:keepNext w:val="0"/>
+              <w:spacing w:after="0" w:line="250" w:lineRule="auto"/>
+            </w:pPr>
+            <w:r>
+              <w:rPr>
+                <w:rFonts w:ascii="Arial" w:hAnsi="Arial"/>
+                <w:b w:val="0"/>
+                <w:color w:val="000000"/>
+                <w:sz w:val="18"/>
+              </w:rPr>
+              <w:t>Negative, zero, 1c/2c and fractional-cent costs rejected for three slots.</w:t>
+            </w:r>
+          </w:p>
+        </w:tc>
+        <w:tc>
+          <w:tcPr>
+            <w:tcW w:type="dxa" w:w="4435"/>
+            <w:vAlign w:val="center"/>
+            <w:tcMar>
+              <w:top w:w="75" w:type="dxa"/>
+              <w:left w:w="75" w:type="dxa"/>
+              <w:bottom w:w="75" w:type="dxa"/>
+              <w:right w:w="75" w:type="dxa"/>
+            </w:tcMar>
+            <w:shd w:fill="FFFFFF"/>
+          </w:tcPr>
+          <w:p>
+            <w:pPr>
+              <w:keepNext w:val="0"/>
+              <w:spacing w:after="0" w:line="250" w:lineRule="auto"/>
+            </w:pPr>
+            <w:r>
+              <w:rPr>
+                <w:rFonts w:ascii="Arial" w:hAnsi="Arial"/>
+                <w:b w:val="0"/>
+                <w:color w:val="000000"/>
+                <w:sz w:val="18"/>
+              </w:rPr>
+              <w:t>C05 partial; accepted costs and reliability not run.</w:t>
+            </w:r>
+          </w:p>
+        </w:tc>
+      </w:tr>
+      <w:tr>
+        <w:trPr>
+          <w:cantSplit/>
+        </w:trPr>
+        <w:tc>
+          <w:tcPr>
+            <w:tcW w:type="dxa" w:w="3168"/>
+            <w:vAlign w:val="center"/>
+            <w:tcMar>
+              <w:top w:w="75" w:type="dxa"/>
+              <w:left w:w="75" w:type="dxa"/>
+              <w:bottom w:w="75" w:type="dxa"/>
+              <w:right w:w="75" w:type="dxa"/>
+            </w:tcMar>
+            <w:shd w:fill="FFFFFF"/>
+          </w:tcPr>
+          <w:p>
+            <w:pPr>
+              <w:keepNext w:val="0"/>
+              <w:spacing w:after="0" w:line="250" w:lineRule="auto"/>
+              <w:jc w:val="center"/>
+            </w:pPr>
+            <w:r>
+              <w:rPr>
+                <w:rFonts w:ascii="Arial" w:hAnsi="Arial"/>
+                <w:b w:val="0"/>
+                <w:color w:val="000000"/>
+                <w:sz w:val="18"/>
+              </w:rPr>
+              <w:t>Price selection</w:t>
+            </w:r>
+          </w:p>
+        </w:tc>
+        <w:tc>
+          <w:tcPr>
+            <w:tcW w:type="dxa" w:w="7488"/>
+            <w:vAlign w:val="center"/>
+            <w:tcMar>
+              <w:top w:w="75" w:type="dxa"/>
+              <w:left w:w="75" w:type="dxa"/>
+              <w:bottom w:w="75" w:type="dxa"/>
+              <w:right w:w="75" w:type="dxa"/>
+            </w:tcMar>
+            <w:shd w:fill="FFFFFF"/>
+          </w:tcPr>
+          <w:p>
+            <w:pPr>
+              <w:keepNext w:val="0"/>
+              <w:spacing w:after="0" w:line="250" w:lineRule="auto"/>
+            </w:pPr>
+            <w:r>
+              <w:rPr>
+                <w:rFonts w:ascii="Arial" w:hAnsi="Arial"/>
+                <w:b w:val="0"/>
+                <w:color w:val="000000"/>
+                <w:sz w:val="18"/>
+              </w:rPr>
+              <w:t>333c suggestion and 167-666c range shown; 166/667/333.5c rejected.</w:t>
+            </w:r>
+          </w:p>
+        </w:tc>
+        <w:tc>
+          <w:tcPr>
+            <w:tcW w:type="dxa" w:w="4435"/>
+            <w:vAlign w:val="center"/>
+            <w:tcMar>
+              <w:top w:w="75" w:type="dxa"/>
+              <w:left w:w="75" w:type="dxa"/>
+              <w:bottom w:w="75" w:type="dxa"/>
+              <w:right w:w="75" w:type="dxa"/>
+            </w:tcMar>
+            <w:shd w:fill="FFFFFF"/>
+          </w:tcPr>
+          <w:p>
+            <w:pPr>
+              <w:keepNext w:val="0"/>
+              <w:spacing w:after="0" w:line="250" w:lineRule="auto"/>
+            </w:pPr>
+            <w:r>
+              <w:rPr>
+                <w:rFonts w:ascii="Arial" w:hAnsi="Arial"/>
+                <w:b w:val="0"/>
+                <w:color w:val="000000"/>
+                <w:sz w:val="18"/>
+              </w:rPr>
+              <w:t>C04 partial; successful saves not run.</w:t>
+            </w:r>
+          </w:p>
+        </w:tc>
+      </w:tr>
+      <w:tr>
+        <w:trPr>
+          <w:cantSplit/>
+        </w:trPr>
+        <w:tc>
+          <w:tcPr>
+            <w:tcW w:type="dxa" w:w="3168"/>
+            <w:vAlign w:val="center"/>
+            <w:tcMar>
+              <w:top w:w="75" w:type="dxa"/>
+              <w:left w:w="75" w:type="dxa"/>
+              <w:bottom w:w="75" w:type="dxa"/>
+              <w:right w:w="75" w:type="dxa"/>
+            </w:tcMar>
+            <w:shd w:fill="FFFFFF"/>
+          </w:tcPr>
+          <w:p>
+            <w:pPr>
+              <w:keepNext w:val="0"/>
+              <w:spacing w:after="0" w:line="250" w:lineRule="auto"/>
+              <w:jc w:val="center"/>
+            </w:pPr>
+            <w:r>
+              <w:rPr>
+                <w:rFonts w:ascii="Arial" w:hAnsi="Arial"/>
+                <w:b w:val="0"/>
+                <w:color w:val="000000"/>
+                <w:sz w:val="18"/>
+              </w:rPr>
+              <w:t>Payout guard and reload</w:t>
+            </w:r>
+          </w:p>
+        </w:tc>
+        <w:tc>
+          <w:tcPr>
+            <w:tcW w:type="dxa" w:w="7488"/>
+            <w:vAlign w:val="center"/>
+            <w:tcMar>
+              <w:top w:w="75" w:type="dxa"/>
+              <w:left w:w="75" w:type="dxa"/>
+              <w:bottom w:w="75" w:type="dxa"/>
+              <w:right w:w="75" w:type="dxa"/>
+            </w:tcMar>
+            <w:shd w:fill="FFFFFF"/>
+          </w:tcPr>
+          <w:p>
+            <w:pPr>
+              <w:keepNext w:val="0"/>
+              <w:spacing w:after="0" w:line="250" w:lineRule="auto"/>
+            </w:pPr>
+            <w:r>
+              <w:rPr>
+                <w:rFonts w:ascii="Arial" w:hAnsi="Arial"/>
+                <w:b w:val="0"/>
+                <w:color w:val="000000"/>
+                <w:sz w:val="18"/>
+              </w:rPr>
+              <w:t>Whitespace-only venue rejected. Valid draft showed payout-setup message; controls remained editable; hosted list stayed empty after reload.</w:t>
+            </w:r>
+          </w:p>
+        </w:tc>
+        <w:tc>
+          <w:tcPr>
+            <w:tcW w:type="dxa" w:w="4435"/>
+            <w:vAlign w:val="center"/>
+            <w:tcMar>
+              <w:top w:w="75" w:type="dxa"/>
+              <w:left w:w="75" w:type="dxa"/>
+              <w:bottom w:w="75" w:type="dxa"/>
+              <w:right w:w="75" w:type="dxa"/>
+            </w:tcMar>
+            <w:shd w:fill="FFFFFF"/>
+          </w:tcPr>
+          <w:p>
+            <w:pPr>
+              <w:keepNext w:val="0"/>
+              <w:spacing w:after="0" w:line="250" w:lineRule="auto"/>
+            </w:pPr>
+            <w:r>
+              <w:rPr>
+                <w:rFonts w:ascii="Arial" w:hAnsi="Arial"/>
+                <w:b w:val="0"/>
+                <w:color w:val="000000"/>
+                <w:sz w:val="18"/>
+              </w:rPr>
+              <w:t>C07 partial; this row is UI evidence, not a database assertion.</w:t>
+            </w:r>
+          </w:p>
+        </w:tc>
+      </w:tr>
+      <w:tr>
+        <w:trPr>
+          <w:cantSplit/>
+        </w:trPr>
+        <w:tc>
+          <w:tcPr>
+            <w:tcW w:type="dxa" w:w="3168"/>
+            <w:vAlign w:val="center"/>
+            <w:tcMar>
+              <w:top w:w="75" w:type="dxa"/>
+              <w:left w:w="75" w:type="dxa"/>
+              <w:bottom w:w="75" w:type="dxa"/>
+              <w:right w:w="75" w:type="dxa"/>
+            </w:tcMar>
+            <w:shd w:fill="FFFFFF"/>
+          </w:tcPr>
+          <w:p>
+            <w:pPr>
+              <w:keepNext w:val="0"/>
+              <w:spacing w:after="0" w:line="250" w:lineRule="auto"/>
+              <w:jc w:val="center"/>
+            </w:pPr>
+            <w:r>
+              <w:rPr>
+                <w:rFonts w:ascii="Arial" w:hAnsi="Arial"/>
+                <w:b w:val="0"/>
+                <w:color w:val="000000"/>
+                <w:sz w:val="18"/>
+              </w:rPr>
+              <w:t>Wallet readiness</w:t>
+            </w:r>
+          </w:p>
+        </w:tc>
+        <w:tc>
+          <w:tcPr>
+            <w:tcW w:type="dxa" w:w="7488"/>
+            <w:vAlign w:val="center"/>
+            <w:tcMar>
+              <w:top w:w="75" w:type="dxa"/>
+              <w:left w:w="75" w:type="dxa"/>
+              <w:bottom w:w="75" w:type="dxa"/>
+              <w:right w:w="75" w:type="dxa"/>
+            </w:tcMar>
+            <w:shd w:fill="FFFFFF"/>
+          </w:tcPr>
+          <w:p>
+            <w:pPr>
+              <w:keepNext w:val="0"/>
+              <w:spacing w:after="0" w:line="250" w:lineRule="auto"/>
+            </w:pPr>
+            <w:r>
+              <w:rPr>
+                <w:rFonts w:ascii="Arial" w:hAnsi="Arial"/>
+                <w:b w:val="0"/>
+                <w:color w:val="000000"/>
+                <w:sz w:val="18"/>
+              </w:rPr>
+              <w:t>Available/held balances S$0.00; no transactions; PayNow top-up coming soon.</w:t>
+            </w:r>
+          </w:p>
+        </w:tc>
+        <w:tc>
+          <w:tcPr>
+            <w:tcW w:type="dxa" w:w="4435"/>
+            <w:vAlign w:val="center"/>
+            <w:tcMar>
+              <w:top w:w="75" w:type="dxa"/>
+              <w:left w:w="75" w:type="dxa"/>
+              <w:bottom w:w="75" w:type="dxa"/>
+              <w:right w:w="75" w:type="dxa"/>
+            </w:tcMar>
+            <w:shd w:fill="FFFFFF"/>
+          </w:tcPr>
+          <w:p>
+            <w:pPr>
+              <w:keepNext w:val="0"/>
+              <w:spacing w:after="0" w:line="250" w:lineRule="auto"/>
+            </w:pPr>
+            <w:r>
+              <w:rPr>
+                <w:rFonts w:ascii="Arial" w:hAnsi="Arial"/>
+                <w:b w:val="0"/>
+                <w:color w:val="000000"/>
+                <w:sz w:val="18"/>
+              </w:rPr>
+              <w:t>No funded participant/refund fixtures.</w:t>
+            </w:r>
+          </w:p>
+        </w:tc>
+      </w:tr>
+      <w:tr>
+        <w:trPr>
+          <w:cantSplit/>
+        </w:trPr>
+        <w:tc>
+          <w:tcPr>
+            <w:tcW w:type="dxa" w:w="3168"/>
+            <w:vAlign w:val="center"/>
+            <w:tcMar>
+              <w:top w:w="75" w:type="dxa"/>
+              <w:left w:w="75" w:type="dxa"/>
+              <w:bottom w:w="75" w:type="dxa"/>
+              <w:right w:w="75" w:type="dxa"/>
+            </w:tcMar>
+            <w:shd w:fill="FFFFFF"/>
+          </w:tcPr>
+          <w:p>
+            <w:pPr>
+              <w:keepNext w:val="0"/>
+              <w:spacing w:after="0" w:line="250" w:lineRule="auto"/>
+              <w:jc w:val="center"/>
+            </w:pPr>
+            <w:r>
+              <w:rPr>
+                <w:rFonts w:ascii="Arial" w:hAnsi="Arial"/>
+                <w:b w:val="0"/>
+                <w:color w:val="000000"/>
+                <w:sz w:val="18"/>
+              </w:rPr>
+              <w:t>Payout readiness</w:t>
+            </w:r>
+          </w:p>
+        </w:tc>
+        <w:tc>
+          <w:tcPr>
+            <w:tcW w:type="dxa" w:w="7488"/>
+            <w:vAlign w:val="center"/>
+            <w:tcMar>
+              <w:top w:w="75" w:type="dxa"/>
+              <w:left w:w="75" w:type="dxa"/>
+              <w:bottom w:w="75" w:type="dxa"/>
+              <w:right w:w="75" w:type="dxa"/>
+            </w:tcMar>
+            <w:shd w:fill="FFFFFF"/>
+          </w:tcPr>
+          <w:p>
+            <w:pPr>
+              <w:keepNext w:val="0"/>
+              <w:spacing w:after="0" w:line="250" w:lineRule="auto"/>
+            </w:pPr>
+            <w:r>
+              <w:rPr>
+                <w:rFonts w:ascii="Arial" w:hAnsi="Arial"/>
+                <w:b w:val="0"/>
+                <w:color w:val="000000"/>
+                <w:sz w:val="18"/>
+              </w:rPr>
+              <w:t>Payouts unavailable message persisted after Try again; no onboarding controls.</w:t>
+            </w:r>
+          </w:p>
+        </w:tc>
+        <w:tc>
+          <w:tcPr>
+            <w:tcW w:type="dxa" w:w="4435"/>
+            <w:vAlign w:val="center"/>
+            <w:tcMar>
+              <w:top w:w="75" w:type="dxa"/>
+              <w:left w:w="75" w:type="dxa"/>
+              <w:bottom w:w="75" w:type="dxa"/>
+              <w:right w:w="75" w:type="dxa"/>
+            </w:tcMar>
+            <w:shd w:fill="FFFFFF"/>
+          </w:tcPr>
+          <w:p>
+            <w:pPr>
+              <w:keepNext w:val="0"/>
+              <w:spacing w:after="0" w:line="250" w:lineRule="auto"/>
+            </w:pPr>
+            <w:r>
+              <w:rPr>
+                <w:rFonts w:ascii="Arial" w:hAnsi="Arial"/>
+                <w:b w:val="0"/>
+                <w:color w:val="000000"/>
+                <w:sz w:val="18"/>
+              </w:rPr>
+              <w:t>AUTH24 blocker; no owned session created.</w:t>
+            </w:r>
+          </w:p>
+        </w:tc>
+      </w:tr>
+    </w:tbl>
+    <w:p>
+      <w:pPr>
+        <w:spacing w:after="20"/>
+      </w:pPr>
+    </w:p>
+    <w:p>
+      <w:r>
+        <w:rPr>
+          <w:b w:val="0"/>
+          <w:sz w:val="18"/>
+        </w:rPr>
+        <w:t>The account remains signed in; no session was created. Client rejections do not prove server validation. The hosted-list reload supports the observed empty UI but is not a database assertion. Browser observations captured no creation HTTP status; the later API run separately recorded the 409 payout guard. No successful visibility change, participant removal, cancellation or refund was executed. Payout onboarding remained unavailable and the wallet offered no top-up flow. Controlled-clock, failure-injection and multi-account fixtures remain outstanding.</w:t>
+      </w:r>
+    </w:p>
+    <w:p>
+      <w:r>
+        <w:rPr>
+          <w:b w:val="0"/>
+          <w:sz w:val="18"/>
+        </w:rPr>
+        <w:t>Evidence: evidence/production/authenticated-browser-observations.json and its per-check accessibility snapshots. Account and payout-guard screenshots are included with the evidence.</w:t>
+      </w:r>
+    </w:p>
+    <w:p>
+      <w:r>
+        <w:br w:type="page"/>
+      </w:r>
+    </w:p>
+    <w:p>
+      <w:pPr>
+        <w:pStyle w:val="Heading1"/>
+      </w:pPr>
+      <w:r>
+        <w:t>Production API checks with the test account</w:t>
+      </w:r>
+    </w:p>
+    <w:p>
+      <w:r>
+        <w:rPr>
+          <w:b w:val="0"/>
+          <w:sz w:val="20"/>
+        </w:rPr>
+        <w:t>A separate production API run completed on 20 October 2026 from 17:37:02 to 17:37:07 Singapore time using normal password sign-in for Neoh Session QA. Nine checks passed and one payout-availability observation was blocked. Tokens remained in process memory and credentials are excluded. Visibility calls used a synthetic nonexistent UUID; no existing session identifier was used.</w:t>
+      </w:r>
+    </w:p>
+    <w:tbl>
+      <w:tblPr>
+        <w:tblW w:type="auto" w:w="0"/>
+        <w:jc w:val="center"/>
+        <w:tblLayout w:type="fixed"/>
+        <w:tblLook w:firstColumn="1" w:firstRow="1" w:lastColumn="0" w:lastRow="0" w:noHBand="0" w:noVBand="1" w:val="04A0"/>
+        <w:tblBorders>
+          <w:top w:val="single" w:sz="4" w:color="D9D9D9"/>
+          <w:left w:val="single" w:sz="4" w:color="D9D9D9"/>
+          <w:bottom w:val="single" w:sz="4" w:color="D9D9D9"/>
+          <w:right w:val="single" w:sz="4" w:color="D9D9D9"/>
+          <w:insideH w:val="single" w:sz="4" w:color="D9D9D9"/>
+          <w:insideV w:val="single" w:sz="4" w:color="D9D9D9"/>
+        </w:tblBorders>
+      </w:tblPr>
+      <w:tblGrid>
+        <w:gridCol w:w="3168"/>
+        <w:gridCol w:w="7488"/>
+        <w:gridCol w:w="4435"/>
+      </w:tblGrid>
+      <w:tr>
+        <w:trPr>
+          <w:cantSplit/>
+          <w:tblHeader/>
+        </w:trPr>
+        <w:tc>
+          <w:tcPr>
+            <w:tcW w:type="dxa" w:w="3168"/>
+            <w:vAlign w:val="center"/>
+            <w:tcMar>
+              <w:top w:w="75" w:type="dxa"/>
+              <w:left w:w="75" w:type="dxa"/>
+              <w:bottom w:w="75" w:type="dxa"/>
+              <w:right w:w="75" w:type="dxa"/>
+            </w:tcMar>
+            <w:shd w:fill="E7E7E7"/>
+          </w:tcPr>
+          <w:p>
+            <w:pPr>
+              <w:keepNext/>
+              <w:spacing w:after="0" w:line="250" w:lineRule="auto"/>
+              <w:jc w:val="center"/>
+            </w:pPr>
+            <w:r>
+              <w:rPr>
+                <w:rFonts w:ascii="Arial" w:hAnsi="Arial"/>
+                <w:b/>
+                <w:color w:val="000000"/>
+                <w:sz w:val="18"/>
+              </w:rPr>
+              <w:t>Check</w:t>
+            </w:r>
+          </w:p>
+        </w:tc>
+        <w:tc>
+          <w:tcPr>
+            <w:tcW w:type="dxa" w:w="7488"/>
+            <w:vAlign w:val="center"/>
+            <w:tcMar>
+              <w:top w:w="75" w:type="dxa"/>
+              <w:left w:w="75" w:type="dxa"/>
+              <w:bottom w:w="75" w:type="dxa"/>
+              <w:right w:w="75" w:type="dxa"/>
+            </w:tcMar>
+            <w:shd w:fill="E7E7E7"/>
+          </w:tcPr>
+          <w:p>
+            <w:pPr>
+              <w:keepNext/>
+              <w:spacing w:after="0" w:line="250" w:lineRule="auto"/>
+            </w:pPr>
+            <w:r>
+              <w:rPr>
+                <w:rFonts w:ascii="Arial" w:hAnsi="Arial"/>
+                <w:b/>
+                <w:color w:val="000000"/>
+                <w:sz w:val="18"/>
+              </w:rPr>
+              <w:t>Observed output</w:t>
+            </w:r>
+          </w:p>
+        </w:tc>
+        <w:tc>
+          <w:tcPr>
+            <w:tcW w:type="dxa" w:w="4435"/>
+            <w:vAlign w:val="center"/>
+            <w:tcMar>
+              <w:top w:w="75" w:type="dxa"/>
+              <w:left w:w="75" w:type="dxa"/>
+              <w:bottom w:w="75" w:type="dxa"/>
+              <w:right w:w="75" w:type="dxa"/>
+            </w:tcMar>
+            <w:shd w:fill="E7E7E7"/>
+          </w:tcPr>
+          <w:p>
+            <w:pPr>
+              <w:keepNext/>
+              <w:spacing w:after="0" w:line="250" w:lineRule="auto"/>
+            </w:pPr>
+            <w:r>
+              <w:rPr>
+                <w:rFonts w:ascii="Arial" w:hAnsi="Arial"/>
+                <w:b/>
+                <w:color w:val="000000"/>
+                <w:sz w:val="18"/>
+              </w:rPr>
+              <w:t>Conclusion</w:t>
+            </w:r>
+          </w:p>
+        </w:tc>
+      </w:tr>
+      <w:tr>
+        <w:trPr>
+          <w:cantSplit/>
+        </w:trPr>
+        <w:tc>
+          <w:tcPr>
+            <w:tcW w:type="dxa" w:w="3168"/>
+            <w:vAlign w:val="center"/>
+            <w:tcMar>
+              <w:top w:w="75" w:type="dxa"/>
+              <w:left w:w="75" w:type="dxa"/>
+              <w:bottom w:w="75" w:type="dxa"/>
+              <w:right w:w="75" w:type="dxa"/>
+            </w:tcMar>
+            <w:shd w:fill="FFFFFF"/>
+          </w:tcPr>
+          <w:p>
+            <w:pPr>
+              <w:keepNext w:val="0"/>
+              <w:spacing w:after="0" w:line="250" w:lineRule="auto"/>
+              <w:jc w:val="center"/>
+            </w:pPr>
+            <w:r>
+              <w:rPr>
+                <w:rFonts w:ascii="Arial" w:hAnsi="Arial"/>
+                <w:b w:val="0"/>
+                <w:color w:val="000000"/>
+                <w:sz w:val="18"/>
+              </w:rPr>
+              <w:t>API01 / V03</w:t>
+            </w:r>
+          </w:p>
+        </w:tc>
+        <w:tc>
+          <w:tcPr>
+            <w:tcW w:type="dxa" w:w="7488"/>
+            <w:vAlign w:val="center"/>
+            <w:tcMar>
+              <w:top w:w="75" w:type="dxa"/>
+              <w:left w:w="75" w:type="dxa"/>
+              <w:bottom w:w="75" w:type="dxa"/>
+              <w:right w:w="75" w:type="dxa"/>
+            </w:tcMar>
+            <w:shd w:fill="FFFFFF"/>
+          </w:tcPr>
+          <w:p>
+            <w:pPr>
+              <w:keepNext w:val="0"/>
+              <w:spacing w:after="0" w:line="250" w:lineRule="auto"/>
+            </w:pPr>
+            <w:r>
+              <w:rPr>
+                <w:rFonts w:ascii="Arial" w:hAnsi="Arial"/>
+                <w:b w:val="0"/>
+                <w:color w:val="000000"/>
+                <w:sz w:val="18"/>
+              </w:rPr>
+              <w:t>Anonymous visibility PATCH returned 401 UNAUTHENTICATED.</w:t>
+            </w:r>
+          </w:p>
+        </w:tc>
+        <w:tc>
+          <w:tcPr>
+            <w:tcW w:type="dxa" w:w="4435"/>
+            <w:vAlign w:val="center"/>
+            <w:tcMar>
+              <w:top w:w="75" w:type="dxa"/>
+              <w:left w:w="75" w:type="dxa"/>
+              <w:bottom w:w="75" w:type="dxa"/>
+              <w:right w:w="75" w:type="dxa"/>
+            </w:tcMar>
+            <w:shd w:fill="FFFFFF"/>
+          </w:tcPr>
+          <w:p>
+            <w:pPr>
+              <w:keepNext w:val="0"/>
+              <w:spacing w:after="0" w:line="250" w:lineRule="auto"/>
+            </w:pPr>
+            <w:r>
+              <w:rPr>
+                <w:rFonts w:ascii="Arial" w:hAnsi="Arial"/>
+                <w:b w:val="0"/>
+                <w:color w:val="000000"/>
+                <w:sz w:val="18"/>
+              </w:rPr>
+              <w:t>Partial: inactive and foreign-owner branches not run.</w:t>
+            </w:r>
+          </w:p>
+        </w:tc>
+      </w:tr>
+      <w:tr>
+        <w:trPr>
+          <w:cantSplit/>
+        </w:trPr>
+        <w:tc>
+          <w:tcPr>
+            <w:tcW w:type="dxa" w:w="3168"/>
+            <w:vAlign w:val="center"/>
+            <w:tcMar>
+              <w:top w:w="75" w:type="dxa"/>
+              <w:left w:w="75" w:type="dxa"/>
+              <w:bottom w:w="75" w:type="dxa"/>
+              <w:right w:w="75" w:type="dxa"/>
+            </w:tcMar>
+            <w:shd w:fill="FFFFFF"/>
+          </w:tcPr>
+          <w:p>
+            <w:pPr>
+              <w:keepNext w:val="0"/>
+              <w:spacing w:after="0" w:line="250" w:lineRule="auto"/>
+              <w:jc w:val="center"/>
+            </w:pPr>
+            <w:r>
+              <w:rPr>
+                <w:rFonts w:ascii="Arial" w:hAnsi="Arial"/>
+                <w:b w:val="0"/>
+                <w:color w:val="000000"/>
+                <w:sz w:val="18"/>
+              </w:rPr>
+              <w:t>API02-API05 / V07</w:t>
+            </w:r>
+          </w:p>
+        </w:tc>
+        <w:tc>
+          <w:tcPr>
+            <w:tcW w:type="dxa" w:w="7488"/>
+            <w:vAlign w:val="center"/>
+            <w:tcMar>
+              <w:top w:w="75" w:type="dxa"/>
+              <w:left w:w="75" w:type="dxa"/>
+              <w:bottom w:w="75" w:type="dxa"/>
+              <w:right w:w="75" w:type="dxa"/>
+            </w:tcMar>
+            <w:shd w:fill="FFFFFF"/>
+          </w:tcPr>
+          <w:p>
+            <w:pPr>
+              <w:keepNext w:val="0"/>
+              <w:spacing w:after="0" w:line="250" w:lineRule="auto"/>
+            </w:pPr>
+            <w:r>
+              <w:rPr>
+                <w:rFonts w:ascii="Arial" w:hAnsi="Arial"/>
+                <w:b w:val="0"/>
+                <w:color w:val="000000"/>
+                <w:sz w:val="18"/>
+              </w:rPr>
+              <w:t>Bad UUID, lowercase visibility, null and missing enum returned 400 INVALID_REQUEST.</w:t>
+            </w:r>
+          </w:p>
+        </w:tc>
+        <w:tc>
+          <w:tcPr>
+            <w:tcW w:type="dxa" w:w="4435"/>
+            <w:vAlign w:val="center"/>
+            <w:tcMar>
+              <w:top w:w="75" w:type="dxa"/>
+              <w:left w:w="75" w:type="dxa"/>
+              <w:bottom w:w="75" w:type="dxa"/>
+              <w:right w:w="75" w:type="dxa"/>
+            </w:tcMar>
+            <w:shd w:fill="FFFFFF"/>
+          </w:tcPr>
+          <w:p>
+            <w:pPr>
+              <w:keepNext w:val="0"/>
+              <w:spacing w:after="0" w:line="250" w:lineRule="auto"/>
+            </w:pPr>
+            <w:r>
+              <w:rPr>
+                <w:rFonts w:ascii="Arial" w:hAnsi="Arial"/>
+                <w:b w:val="0"/>
+                <w:color w:val="000000"/>
+                <w:sz w:val="18"/>
+              </w:rPr>
+              <w:t>Four invalid transport subcases pass.</w:t>
+            </w:r>
+          </w:p>
+        </w:tc>
+      </w:tr>
+      <w:tr>
+        <w:trPr>
+          <w:cantSplit/>
+        </w:trPr>
+        <w:tc>
+          <w:tcPr>
+            <w:tcW w:type="dxa" w:w="3168"/>
+            <w:vAlign w:val="center"/>
+            <w:tcMar>
+              <w:top w:w="75" w:type="dxa"/>
+              <w:left w:w="75" w:type="dxa"/>
+              <w:bottom w:w="75" w:type="dxa"/>
+              <w:right w:w="75" w:type="dxa"/>
+            </w:tcMar>
+            <w:shd w:fill="FFFFFF"/>
+          </w:tcPr>
+          <w:p>
+            <w:pPr>
+              <w:keepNext w:val="0"/>
+              <w:spacing w:after="0" w:line="250" w:lineRule="auto"/>
+              <w:jc w:val="center"/>
+            </w:pPr>
+            <w:r>
+              <w:rPr>
+                <w:rFonts w:ascii="Arial" w:hAnsi="Arial"/>
+                <w:b w:val="0"/>
+                <w:color w:val="000000"/>
+                <w:sz w:val="18"/>
+              </w:rPr>
+              <w:t>API06-API07 / V07</w:t>
+            </w:r>
+          </w:p>
+        </w:tc>
+        <w:tc>
+          <w:tcPr>
+            <w:tcW w:type="dxa" w:w="7488"/>
+            <w:vAlign w:val="center"/>
+            <w:tcMar>
+              <w:top w:w="75" w:type="dxa"/>
+              <w:left w:w="75" w:type="dxa"/>
+              <w:bottom w:w="75" w:type="dxa"/>
+              <w:right w:w="75" w:type="dxa"/>
+            </w:tcMar>
+            <w:shd w:fill="FFFFFF"/>
+          </w:tcPr>
+          <w:p>
+            <w:pPr>
+              <w:keepNext w:val="0"/>
+              <w:spacing w:after="0" w:line="250" w:lineRule="auto"/>
+            </w:pPr>
+            <w:r>
+              <w:rPr>
+                <w:rFonts w:ascii="Arial" w:hAnsi="Arial"/>
+                <w:b w:val="0"/>
+                <w:color w:val="000000"/>
+                <w:sz w:val="18"/>
+              </w:rPr>
+              <w:t>Valid PUBLIC and PRIVATE values returned 404 NOT_FOUND for the synthetic session UUID.</w:t>
+            </w:r>
+          </w:p>
+        </w:tc>
+        <w:tc>
+          <w:tcPr>
+            <w:tcW w:type="dxa" w:w="4435"/>
+            <w:vAlign w:val="center"/>
+            <w:tcMar>
+              <w:top w:w="75" w:type="dxa"/>
+              <w:left w:w="75" w:type="dxa"/>
+              <w:bottom w:w="75" w:type="dxa"/>
+              <w:right w:w="75" w:type="dxa"/>
+            </w:tcMar>
+            <w:shd w:fill="FFFFFF"/>
+          </w:tcPr>
+          <w:p>
+            <w:pPr>
+              <w:keepNext w:val="0"/>
+              <w:spacing w:after="0" w:line="250" w:lineRule="auto"/>
+            </w:pPr>
+            <w:r>
+              <w:rPr>
+                <w:rFonts w:ascii="Arial" w:hAnsi="Arial"/>
+                <w:b w:val="0"/>
+                <w:color w:val="000000"/>
+                <w:sz w:val="18"/>
+              </w:rPr>
+              <w:t>Two valid parser subcases pass; no mutation success.</w:t>
+            </w:r>
+          </w:p>
+        </w:tc>
+      </w:tr>
+      <w:tr>
+        <w:trPr>
+          <w:cantSplit/>
+        </w:trPr>
+        <w:tc>
+          <w:tcPr>
+            <w:tcW w:type="dxa" w:w="3168"/>
+            <w:vAlign w:val="center"/>
+            <w:tcMar>
+              <w:top w:w="75" w:type="dxa"/>
+              <w:left w:w="75" w:type="dxa"/>
+              <w:bottom w:w="75" w:type="dxa"/>
+              <w:right w:w="75" w:type="dxa"/>
+            </w:tcMar>
+            <w:shd w:fill="FFFFFF"/>
+          </w:tcPr>
+          <w:p>
+            <w:pPr>
+              <w:keepNext w:val="0"/>
+              <w:spacing w:after="0" w:line="250" w:lineRule="auto"/>
+              <w:jc w:val="center"/>
+            </w:pPr>
+            <w:r>
+              <w:rPr>
+                <w:rFonts w:ascii="Arial" w:hAnsi="Arial"/>
+                <w:b w:val="0"/>
+                <w:color w:val="000000"/>
+                <w:sz w:val="18"/>
+              </w:rPr>
+              <w:t>API08 / fixture readiness</w:t>
+            </w:r>
+          </w:p>
+        </w:tc>
+        <w:tc>
+          <w:tcPr>
+            <w:tcW w:type="dxa" w:w="7488"/>
+            <w:vAlign w:val="center"/>
+            <w:tcMar>
+              <w:top w:w="75" w:type="dxa"/>
+              <w:left w:w="75" w:type="dxa"/>
+              <w:bottom w:w="75" w:type="dxa"/>
+              <w:right w:w="75" w:type="dxa"/>
+            </w:tcMar>
+            <w:shd w:fill="FFFFFF"/>
+          </w:tcPr>
+          <w:p>
+            <w:pPr>
+              <w:keepNext w:val="0"/>
+              <w:spacing w:after="0" w:line="250" w:lineRule="auto"/>
+            </w:pPr>
+            <w:r>
+              <w:rPr>
+                <w:rFonts w:ascii="Arial" w:hAnsi="Arial"/>
+                <w:b w:val="0"/>
+                <w:color w:val="000000"/>
+                <w:sz w:val="18"/>
+              </w:rPr>
+              <w:t>Payout-account GET returned 503 PAYOUTS_UNAVAILABLE.</w:t>
+            </w:r>
+          </w:p>
+        </w:tc>
+        <w:tc>
+          <w:tcPr>
+            <w:tcW w:type="dxa" w:w="4435"/>
+            <w:vAlign w:val="center"/>
+            <w:tcMar>
+              <w:top w:w="75" w:type="dxa"/>
+              <w:left w:w="75" w:type="dxa"/>
+              <w:bottom w:w="75" w:type="dxa"/>
+              <w:right w:w="75" w:type="dxa"/>
+            </w:tcMar>
+            <w:shd w:fill="FFFFFF"/>
+          </w:tcPr>
+          <w:p>
+            <w:pPr>
+              <w:keepNext w:val="0"/>
+              <w:spacing w:after="0" w:line="250" w:lineRule="auto"/>
+            </w:pPr>
+            <w:r>
+              <w:rPr>
+                <w:rFonts w:ascii="Arial" w:hAnsi="Arial"/>
+                <w:b w:val="0"/>
+                <w:color w:val="000000"/>
+                <w:sz w:val="18"/>
+              </w:rPr>
+              <w:t>BLOCKED readiness observation, not a successful payout test.</w:t>
+            </w:r>
+          </w:p>
+        </w:tc>
+      </w:tr>
+      <w:tr>
+        <w:trPr>
+          <w:cantSplit/>
+        </w:trPr>
+        <w:tc>
+          <w:tcPr>
+            <w:tcW w:type="dxa" w:w="3168"/>
+            <w:vAlign w:val="center"/>
+            <w:tcMar>
+              <w:top w:w="75" w:type="dxa"/>
+              <w:left w:w="75" w:type="dxa"/>
+              <w:bottom w:w="75" w:type="dxa"/>
+              <w:right w:w="75" w:type="dxa"/>
+            </w:tcMar>
+            <w:shd w:fill="FFFFFF"/>
+          </w:tcPr>
+          <w:p>
+            <w:pPr>
+              <w:keepNext w:val="0"/>
+              <w:spacing w:after="0" w:line="250" w:lineRule="auto"/>
+              <w:jc w:val="center"/>
+            </w:pPr>
+            <w:r>
+              <w:rPr>
+                <w:rFonts w:ascii="Arial" w:hAnsi="Arial"/>
+                <w:b w:val="0"/>
+                <w:color w:val="000000"/>
+                <w:sz w:val="18"/>
+              </w:rPr>
+              <w:t>API09 / C07</w:t>
+            </w:r>
+          </w:p>
+        </w:tc>
+        <w:tc>
+          <w:tcPr>
+            <w:tcW w:type="dxa" w:w="7488"/>
+            <w:vAlign w:val="center"/>
+            <w:tcMar>
+              <w:top w:w="75" w:type="dxa"/>
+              <w:left w:w="75" w:type="dxa"/>
+              <w:bottom w:w="75" w:type="dxa"/>
+              <w:right w:w="75" w:type="dxa"/>
+            </w:tcMar>
+            <w:shd w:fill="FFFFFF"/>
+          </w:tcPr>
+          <w:p>
+            <w:pPr>
+              <w:keepNext w:val="0"/>
+              <w:spacing w:after="0" w:line="250" w:lineRule="auto"/>
+            </w:pPr>
+            <w:r>
+              <w:rPr>
+                <w:rFonts w:ascii="Arial" w:hAnsi="Arial"/>
+                <w:b w:val="0"/>
+                <w:color w:val="000000"/>
+                <w:sz w:val="18"/>
+              </w:rPr>
+              <w:t>Otherwise-valid creation POST returned 409 PAYOUT_ACCOUNT_NOT_READY.</w:t>
+            </w:r>
+          </w:p>
+        </w:tc>
+        <w:tc>
+          <w:tcPr>
+            <w:tcW w:type="dxa" w:w="4435"/>
+            <w:vAlign w:val="center"/>
+            <w:tcMar>
+              <w:top w:w="75" w:type="dxa"/>
+              <w:left w:w="75" w:type="dxa"/>
+              <w:bottom w:w="75" w:type="dxa"/>
+              <w:right w:w="75" w:type="dxa"/>
+            </w:tcMar>
+            <w:shd w:fill="FFFFFF"/>
+          </w:tcPr>
+          <w:p>
+            <w:pPr>
+              <w:keepNext w:val="0"/>
+              <w:spacing w:after="0" w:line="250" w:lineRule="auto"/>
+            </w:pPr>
+            <w:r>
+              <w:rPr>
+                <w:rFonts w:ascii="Arial" w:hAnsi="Arial"/>
+                <w:b w:val="0"/>
+                <w:color w:val="000000"/>
+                <w:sz w:val="18"/>
+              </w:rPr>
+              <w:t>Payout guard verified; no successful creation.</w:t>
+            </w:r>
+          </w:p>
+        </w:tc>
+      </w:tr>
+      <w:tr>
+        <w:trPr>
+          <w:cantSplit/>
+        </w:trPr>
+        <w:tc>
+          <w:tcPr>
+            <w:tcW w:type="dxa" w:w="3168"/>
+            <w:vAlign w:val="center"/>
+            <w:tcMar>
+              <w:top w:w="75" w:type="dxa"/>
+              <w:left w:w="75" w:type="dxa"/>
+              <w:bottom w:w="75" w:type="dxa"/>
+              <w:right w:w="75" w:type="dxa"/>
+            </w:tcMar>
+            <w:shd w:fill="FFFFFF"/>
+          </w:tcPr>
+          <w:p>
+            <w:pPr>
+              <w:keepNext w:val="0"/>
+              <w:spacing w:after="0" w:line="250" w:lineRule="auto"/>
+              <w:jc w:val="center"/>
+            </w:pPr>
+            <w:r>
+              <w:rPr>
+                <w:rFonts w:ascii="Arial" w:hAnsi="Arial"/>
+                <w:b w:val="0"/>
+                <w:color w:val="000000"/>
+                <w:sz w:val="18"/>
+              </w:rPr>
+              <w:t>API10 / C07 supplemental</w:t>
+            </w:r>
+          </w:p>
+        </w:tc>
+        <w:tc>
+          <w:tcPr>
+            <w:tcW w:type="dxa" w:w="7488"/>
+            <w:vAlign w:val="center"/>
+            <w:tcMar>
+              <w:top w:w="75" w:type="dxa"/>
+              <w:left w:w="75" w:type="dxa"/>
+              <w:bottom w:w="75" w:type="dxa"/>
+              <w:right w:w="75" w:type="dxa"/>
+            </w:tcMar>
+            <w:shd w:fill="FFFFFF"/>
+          </w:tcPr>
+          <w:p>
+            <w:pPr>
+              <w:keepNext w:val="0"/>
+              <w:spacing w:after="0" w:line="250" w:lineRule="auto"/>
+            </w:pPr>
+            <w:r>
+              <w:rPr>
+                <w:rFonts w:ascii="Arial" w:hAnsi="Arial"/>
+                <w:b w:val="0"/>
+                <w:color w:val="000000"/>
+                <w:sz w:val="18"/>
+              </w:rPr>
+              <w:t>Hosted-session GET returned 200 and session_count=0.</w:t>
+            </w:r>
+          </w:p>
+        </w:tc>
+        <w:tc>
+          <w:tcPr>
+            <w:tcW w:type="dxa" w:w="4435"/>
+            <w:vAlign w:val="center"/>
+            <w:tcMar>
+              <w:top w:w="75" w:type="dxa"/>
+              <w:left w:w="75" w:type="dxa"/>
+              <w:bottom w:w="75" w:type="dxa"/>
+              <w:right w:w="75" w:type="dxa"/>
+            </w:tcMar>
+            <w:shd w:fill="FFFFFF"/>
+          </w:tcPr>
+          <w:p>
+            <w:pPr>
+              <w:keepNext w:val="0"/>
+              <w:spacing w:after="0" w:line="250" w:lineRule="auto"/>
+            </w:pPr>
+            <w:r>
+              <w:rPr>
+                <w:rFonts w:ascii="Arial" w:hAnsi="Arial"/>
+                <w:b w:val="0"/>
+                <w:color w:val="000000"/>
+                <w:sz w:val="18"/>
+              </w:rPr>
+              <w:t>Application projection only; not a direct database assertion.</w:t>
+            </w:r>
+          </w:p>
+        </w:tc>
+      </w:tr>
+    </w:tbl>
+    <w:p>
+      <w:pPr>
+        <w:spacing w:after="20"/>
+      </w:pPr>
+    </w:p>
+    <w:p>
+      <w:r>
+        <w:rPr>
+          <w:b w:val="0"/>
+          <w:sz w:val="18"/>
+        </w:rPr>
+        <w:t>The 9 passes and 1 blocker belong to a separate API run and overlap with earlier browser assertions. Valid visibility enums reached the workflow but could not find the synthetic session; no stored visibility changed. The hosted endpoint is an application projection. No payout configuration change, provider onboarding, transfer, created session, participant, refund, cancellation or concurrency fixture is claimed.</w:t>
+      </w:r>
+    </w:p>
+    <w:p>
+      <w:r>
+        <w:rPr>
+          <w:b w:val="0"/>
+          <w:sz w:val="18"/>
+        </w:rPr>
+        <w:t>Evidence: evidence/production/authenticated-api-observations.json retains sanitized request inputs, response status/error codes and timestamps. Authentication used the normal password login; credentials and tokens are excluded.</w:t>
       </w:r>
     </w:p>
     <w:p>

</xml_diff>